<commit_message>
feat: add declaration, joint stipulation, and generic pleading fragments
- Add memo, declaration, joint_stip, generic as fragment types
- Wire up all new fragments in generator, routes, frontend, and AI prompt
- Remove master template and split script (no longer needed)
- Update AI section suggestions for new document types

Co-Authored-By: Claude Opus 4.5 <noreply@anthropic.com>
</commit_message>
<xml_diff>
--- a/templates/pleadings/base_subdoc.docx
+++ b/templates/pleadings/base_subdoc.docx
@@ -81,22 +81,14 @@
               <w:t>associate</w:t>
             </w:r>
             <w:r>
-              <w:t>_</w:t>
-            </w:r>
-            <w:proofErr w:type="gramStart"/>
-            <w:r>
-              <w:t>n</w:t>
+              <w:t>_n</w:t>
             </w:r>
             <w:r>
               <w:t>ame</w:t>
             </w:r>
             <w:proofErr w:type="spellEnd"/>
             <w:r>
-              <w:t>}} (</w:t>
-            </w:r>
-            <w:proofErr w:type="gramEnd"/>
-            <w:r>
-              <w:t>SBN</w:t>
+              <w:t>}} (SBN</w:t>
             </w:r>
             <w:r>
               <w:t xml:space="preserve"> {{</w:t>
@@ -106,11 +98,7 @@
               <w:t>associate</w:t>
             </w:r>
             <w:r>
-              <w:t>_</w:t>
-            </w:r>
-            <w:proofErr w:type="gramStart"/>
-            <w:r>
-              <w:t>b</w:t>
+              <w:t>_b</w:t>
             </w:r>
             <w:r>
               <w:t>ar</w:t>
@@ -119,7 +107,6 @@
             <w:r>
               <w:t>}})</w:t>
             </w:r>
-            <w:proofErr w:type="gramEnd"/>
           </w:p>
           <w:p>
             <w:pPr>
@@ -353,23 +340,17 @@
               <w:pStyle w:val="AllPurpose"/>
               <w:spacing w:line="260" w:lineRule="exact"/>
             </w:pPr>
-            <w:bookmarkStart w:id="1" w:name="_Hlk218869692"/>
             <w:r>
               <w:t>{{</w:t>
             </w:r>
             <w:proofErr w:type="spellStart"/>
             <w:r>
-              <w:t>plaintiff_</w:t>
-            </w:r>
-            <w:proofErr w:type="gramStart"/>
-            <w:r>
-              <w:t>caption</w:t>
+              <w:t>plaintiff_caption</w:t>
             </w:r>
             <w:proofErr w:type="spellEnd"/>
             <w:r>
               <w:t>}},</w:t>
             </w:r>
-            <w:proofErr w:type="gramEnd"/>
           </w:p>
           <w:p>
             <w:pPr>
@@ -459,17 +440,12 @@
             </w:r>
             <w:proofErr w:type="spellStart"/>
             <w:r>
-              <w:t>defendant_</w:t>
-            </w:r>
-            <w:proofErr w:type="gramStart"/>
-            <w:r>
-              <w:t>caption</w:t>
+              <w:t>defendant_caption</w:t>
             </w:r>
             <w:proofErr w:type="spellEnd"/>
             <w:r>
               <w:t>}},</w:t>
             </w:r>
-            <w:proofErr w:type="gramEnd"/>
           </w:p>
           <w:p>
             <w:pPr>
@@ -588,18 +564,9 @@
                 <w:rFonts w:ascii="Times New Roman" w:hAnsi="Times New Roman"/>
                 <w:sz w:val="28"/>
               </w:rPr>
-              <w:t>Case No</w:t>
-            </w:r>
-            <w:proofErr w:type="gramStart"/>
-            <w:r>
-              <w:rPr>
-                <w:rFonts w:ascii="Times New Roman" w:hAnsi="Times New Roman"/>
-                <w:sz w:val="28"/>
-              </w:rPr>
-              <w:t>.: {{</w:t>
+              <w:t>Case No.: {{</w:t>
             </w:r>
             <w:proofErr w:type="spellStart"/>
-            <w:proofErr w:type="gramEnd"/>
             <w:r>
               <w:rPr>
                 <w:rFonts w:ascii="Times New Roman" w:hAnsi="Times New Roman"/>
@@ -772,15 +739,7 @@
                 <w:rFonts w:ascii="Times New Roman" w:hAnsi="Times New Roman"/>
                 <w:sz w:val="28"/>
               </w:rPr>
-              <w:t>hearing_</w:t>
-            </w:r>
-            <w:proofErr w:type="gramStart"/>
-            <w:r>
-              <w:rPr>
-                <w:rFonts w:ascii="Times New Roman" w:hAnsi="Times New Roman"/>
-                <w:sz w:val="28"/>
-              </w:rPr>
-              <w:t>info</w:t>
+              <w:t>hearing_info</w:t>
             </w:r>
             <w:proofErr w:type="spellEnd"/>
             <w:r>
@@ -790,7 +749,6 @@
               </w:rPr>
               <w:t xml:space="preserve"> %}</w:t>
             </w:r>
-            <w:proofErr w:type="gramEnd"/>
           </w:p>
           <w:p>
             <w:pPr>
@@ -950,7 +908,6 @@
               </w:rPr>
             </w:pPr>
             <w:proofErr w:type="spellStart"/>
-            <w:proofErr w:type="gramStart"/>
             <w:r>
               <w:rPr>
                 <w:rFonts w:ascii="Times New Roman" w:hAnsi="Times New Roman"/>
@@ -967,7 +924,6 @@
               <w:t>: {{</w:t>
             </w:r>
             <w:proofErr w:type="spellStart"/>
-            <w:proofErr w:type="gramEnd"/>
             <w:r>
               <w:rPr>
                 <w:rFonts w:ascii="Times New Roman" w:hAnsi="Times New Roman"/>
@@ -1014,7 +970,7 @@
         <w:pStyle w:val="normal0"/>
       </w:pPr>
       <w:r>
-        <w:t xml:space="preserve">{%p if include_notice %}</w:t>
+        <w:t>{%p if include_notice %}</w:t>
       </w:r>
     </w:p>
     <w:p>
@@ -1022,7 +978,7 @@
         <w:pStyle w:val="normal0"/>
       </w:pPr>
       <w:r>
-        <w:t xml:space="preserve">{{ subdoc_notice }}</w:t>
+        <w:t>{{ subdoc_notice }}</w:t>
       </w:r>
     </w:p>
     <w:p>
@@ -1030,7 +986,7 @@
         <w:pStyle w:val="normal0"/>
       </w:pPr>
       <w:r>
-        <w:t xml:space="preserve">{%p endif %}</w:t>
+        <w:t>{%p endif %}</w:t>
       </w:r>
     </w:p>
     <w:p>
@@ -1038,7 +994,7 @@
         <w:pStyle w:val="normal0"/>
       </w:pPr>
       <w:r>
-        <w:t xml:space="preserve">{%p if include_meet_confer %}</w:t>
+        <w:t>{%p if include_meet_confer %}</w:t>
       </w:r>
     </w:p>
     <w:p>
@@ -1046,7 +1002,7 @@
         <w:pStyle w:val="normal0"/>
       </w:pPr>
       <w:r>
-        <w:t xml:space="preserve">{{ subdoc_meet_confer }}</w:t>
+        <w:t>{{ subdoc_meet_confer }}</w:t>
       </w:r>
     </w:p>
     <w:p>
@@ -1054,7 +1010,7 @@
         <w:pStyle w:val="normal0"/>
       </w:pPr>
       <w:r>
-        <w:t xml:space="preserve">{%p endif %}</w:t>
+        <w:t>{%p endif %}</w:t>
       </w:r>
     </w:p>
     <w:p>
@@ -1062,7 +1018,7 @@
         <w:pStyle w:val="normal0"/>
       </w:pPr>
       <w:r>
-        <w:t xml:space="preserve">{%p if include_toc %}</w:t>
+        <w:t>{%p if include_toc %}</w:t>
       </w:r>
     </w:p>
     <w:p>
@@ -1070,7 +1026,7 @@
         <w:pStyle w:val="normal0"/>
       </w:pPr>
       <w:r>
-        <w:t xml:space="preserve">{{ subdoc_toc }}</w:t>
+        <w:t>{{ subdoc_toc }}</w:t>
       </w:r>
     </w:p>
     <w:p>
@@ -1078,7 +1034,7 @@
         <w:pStyle w:val="normal0"/>
       </w:pPr>
       <w:r>
-        <w:t xml:space="preserve">{%p endif %}</w:t>
+        <w:t>{%p endif %}</w:t>
       </w:r>
     </w:p>
     <w:p>
@@ -1086,7 +1042,7 @@
         <w:pStyle w:val="normal0"/>
       </w:pPr>
       <w:r>
-        <w:t xml:space="preserve">{%p if include_toa %}</w:t>
+        <w:t>{%p if include_toa %}</w:t>
       </w:r>
     </w:p>
     <w:p>
@@ -1094,7 +1050,7 @@
         <w:pStyle w:val="normal0"/>
       </w:pPr>
       <w:r>
-        <w:t xml:space="preserve">{{ subdoc_toa }}</w:t>
+        <w:t>{{ subdoc_toa }}</w:t>
       </w:r>
     </w:p>
     <w:p>
@@ -1102,493 +1058,76 @@
         <w:pStyle w:val="normal0"/>
       </w:pPr>
       <w:r>
-        <w:t xml:space="preserve">{%p endif %}</w:t>
+        <w:t>{%p endif %}</w:t>
       </w:r>
     </w:p>
     <w:p>
       <w:pPr>
         <w:pStyle w:val="normal0"/>
-        <w:ind w:firstLine="0"/>
-        <w:jc w:val="center"/>
-        <w:rPr>
-          <w:b/>
-          <w:bCs/>
-          <w:u w:val="single"/>
-        </w:rPr>
       </w:pPr>
       <w:r>
-        <w:rPr>
-          <w:b/>
-          <w:bCs/>
-          <w:u w:val="single"/>
-        </w:rPr>
         <w:lastRenderedPageBreak/>
-        <w:t>MEMORANDUM OF POINTS AND AUTHORITIES</w:t>
+        <w:t>{%p if include_memo %}</w:t>
       </w:r>
     </w:p>
     <w:p>
       <w:pPr>
-        <w:pStyle w:val="Heading1"/>
-      </w:pPr>
-      <w:bookmarkStart w:id="8" w:name="_Toc217305348"/>
-      <w:bookmarkStart w:id="9" w:name="_Toc217371974"/>
+        <w:pStyle w:val="normal0"/>
+      </w:pPr>
       <w:r>
-        <w:t>Introduction</w:t>
-      </w:r>
-      <w:bookmarkEnd w:id="8"/>
-      <w:bookmarkEnd w:id="9"/>
-    </w:p>
-    <w:p>
-      <w:pPr>
-        <w:pStyle w:val="Heading1"/>
-      </w:pPr>
-      <w:bookmarkStart w:id="10" w:name="_Toc217305349"/>
-      <w:bookmarkStart w:id="11" w:name="_Toc217371975"/>
-      <w:r>
-        <w:t>Legal Standard</w:t>
-      </w:r>
-      <w:bookmarkEnd w:id="10"/>
-      <w:bookmarkEnd w:id="11"/>
-    </w:p>
-    <w:p>
-      <w:pPr>
-        <w:pStyle w:val="Heading1"/>
-      </w:pPr>
-      <w:bookmarkStart w:id="12" w:name="_Toc217305350"/>
-      <w:bookmarkStart w:id="13" w:name="_Toc217371976"/>
-      <w:r>
-        <w:t>Argument</w:t>
-      </w:r>
-      <w:bookmarkEnd w:id="12"/>
-      <w:bookmarkEnd w:id="13"/>
-    </w:p>
-    <w:p>
-      <w:pPr>
-        <w:pStyle w:val="Heading1"/>
-      </w:pPr>
-      <w:bookmarkStart w:id="14" w:name="_Toc217305358"/>
-      <w:bookmarkStart w:id="15" w:name="_Toc217371977"/>
-      <w:r>
-        <w:t>Conclusion</w:t>
-      </w:r>
-      <w:bookmarkEnd w:id="14"/>
-      <w:bookmarkEnd w:id="15"/>
-    </w:p>
-    <w:p>
-      <w:pPr>
-        <w:pStyle w:val="normal0"/>
-        <w:ind w:firstLine="0"/>
-      </w:pPr>
-    </w:p>
-    <w:p>
-      <w:pPr>
-        <w:pStyle w:val="normal0"/>
-        <w:ind w:firstLine="0"/>
-      </w:pPr>
-      <w:r>
-        <w:t>Dated:</w:t>
-      </w:r>
-      <w:r>
-        <w:t xml:space="preserve"> </w:t>
-      </w:r>
-      <w:r>
-        <w:fldChar w:fldCharType="begin"/>
-      </w:r>
-      <w:r>
-        <w:instrText xml:space="preserve"> DATE \@ "MMMM d, yyyy" </w:instrText>
-      </w:r>
-      <w:r>
-        <w:fldChar w:fldCharType="separate"/>
-      </w:r>
-      <w:r>
-        <w:rPr>
-          <w:noProof/>
-        </w:rPr>
-        <w:t>January 15, 2026</w:t>
-      </w:r>
-      <w:r>
-        <w:fldChar w:fldCharType="end"/>
-      </w:r>
-      <w:r>
-        <w:tab/>
-      </w:r>
-      <w:r>
-        <w:tab/>
-      </w:r>
-      <w:r>
-        <w:rPr>
-          <w:b/>
-          <w:bCs/>
-        </w:rPr>
-        <w:t>LAW OFFICES OF DALE K. GALIPO</w:t>
+        <w:t>{{ subdoc_memo }}</w:t>
       </w:r>
     </w:p>
     <w:p>
       <w:pPr>
-        <w:pStyle w:val="AllPurpose"/>
-        <w:keepNext/>
-        <w:keepLines/>
-        <w:spacing w:line="240" w:lineRule="auto"/>
+        <w:pStyle w:val="normal0"/>
       </w:pPr>
       <w:r>
-        <w:tab/>
-      </w:r>
-      <w:r>
-        <w:tab/>
-      </w:r>
-      <w:r>
-        <w:tab/>
-      </w:r>
-      <w:r>
-        <w:tab/>
-      </w:r>
-      <w:r>
-        <w:tab/>
+        <w:t>{%p endif %}</w:t>
       </w:r>
     </w:p>
     <w:p>
       <w:pPr>
         <w:pStyle w:val="normal0"/>
-        <w:keepNext/>
-        <w:keepLines/>
-        <w:rPr>
-          <w:iCs/>
-        </w:rPr>
       </w:pPr>
       <w:r>
-        <w:rPr>
-          <w:noProof/>
-        </w:rPr>
-        <mc:AlternateContent>
-          <mc:Choice Requires="wps">
-            <w:drawing>
-              <wp:anchor distT="0" distB="0" distL="114300" distR="114300" simplePos="0" relativeHeight="251661312" behindDoc="0" locked="0" layoutInCell="1" allowOverlap="1" wp14:anchorId="606227D4" wp14:editId="309EEBCC">
-                <wp:simplePos x="0" y="0"/>
-                <wp:positionH relativeFrom="column">
-                  <wp:posOffset>2743200</wp:posOffset>
-                </wp:positionH>
-                <wp:positionV relativeFrom="paragraph">
-                  <wp:posOffset>276860</wp:posOffset>
-                </wp:positionV>
-                <wp:extent cx="2743200" cy="0"/>
-                <wp:effectExtent l="0" t="0" r="0" b="0"/>
-                <wp:wrapNone/>
-                <wp:docPr id="1532320429" name="Straight Connector 5"/>
-                <wp:cNvGraphicFramePr/>
-                <a:graphic xmlns:a="http://schemas.openxmlformats.org/drawingml/2006/main">
-                  <a:graphicData uri="http://schemas.microsoft.com/office/word/2010/wordprocessingShape">
-                    <wps:wsp>
-                      <wps:cNvCnPr/>
-                      <wps:spPr>
-                        <a:xfrm>
-                          <a:off x="0" y="0"/>
-                          <a:ext cx="2743200" cy="0"/>
-                        </a:xfrm>
-                        <a:prstGeom prst="line">
-                          <a:avLst/>
-                        </a:prstGeom>
-                      </wps:spPr>
-                      <wps:style>
-                        <a:lnRef idx="2">
-                          <a:schemeClr val="dk1"/>
-                        </a:lnRef>
-                        <a:fillRef idx="0">
-                          <a:schemeClr val="dk1"/>
-                        </a:fillRef>
-                        <a:effectRef idx="1">
-                          <a:schemeClr val="dk1"/>
-                        </a:effectRef>
-                        <a:fontRef idx="minor">
-                          <a:schemeClr val="tx1"/>
-                        </a:fontRef>
-                      </wps:style>
-                      <wps:bodyPr/>
-                    </wps:wsp>
-                  </a:graphicData>
-                </a:graphic>
-                <wp14:sizeRelH relativeFrom="margin">
-                  <wp14:pctWidth>0</wp14:pctWidth>
-                </wp14:sizeRelH>
-              </wp:anchor>
-            </w:drawing>
-          </mc:Choice>
-          <mc:Fallback>
-            <w:pict>
-              <v:line w14:anchorId="3D5EF41D" id="Straight Connector 5" o:spid="_x0000_s1026" style="position:absolute;z-index:251661312;visibility:visible;mso-wrap-style:square;mso-width-percent:0;mso-wrap-distance-left:9pt;mso-wrap-distance-top:0;mso-wrap-distance-right:9pt;mso-wrap-distance-bottom:0;mso-position-horizontal:absolute;mso-position-horizontal-relative:text;mso-position-vertical:absolute;mso-position-vertical-relative:text;mso-width-percent:0;mso-width-relative:margin" from="3in,21.8pt" to="6in,21.8pt" o:gfxdata="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" strokecolor="black [3200]" strokeweight="1pt">
-                <v:stroke joinstyle="miter"/>
-              </v:line>
-            </w:pict>
-          </mc:Fallback>
-        </mc:AlternateContent>
+        <w:t xml:space="preserve">{%p if </w:t>
       </w:r>
+      <w:proofErr w:type="spellStart"/>
       <w:r>
-        <w:tab/>
+        <w:t>include_declaration</w:t>
       </w:r>
+      <w:proofErr w:type="spellEnd"/>
       <w:r>
-        <w:tab/>
+        <w:t xml:space="preserve"> %}</w:t>
       </w:r>
+    </w:p>
+    <w:p>
+      <w:pPr>
+        <w:pStyle w:val="normal0"/>
+      </w:pPr>
+      <w:proofErr w:type="gramStart"/>
       <w:r>
-        <w:tab/>
+        <w:t xml:space="preserve">{{ </w:t>
       </w:r>
+      <w:proofErr w:type="spellStart"/>
       <w:r>
-        <w:tab/>
+        <w:t>subdoc</w:t>
+      </w:r>
+      <w:proofErr w:type="gramEnd"/>
+      <w:r>
+        <w:t>_</w:t>
       </w:r>
       <w:proofErr w:type="gramStart"/>
       <w:r>
-        <w:t>By</w:t>
+        <w:t>declaration</w:t>
+      </w:r>
+      <w:proofErr w:type="spellEnd"/>
+      <w:r>
+        <w:t xml:space="preserve"> }</w:t>
       </w:r>
       <w:proofErr w:type="gramEnd"/>
       <w:r>
-        <w:t>:</w:t>
-      </w:r>
-      <w:r>
-        <w:tab/>
-      </w:r>
-      <w:r>
-        <w:rPr>
-          <w:i/>
-          <w:iCs/>
-        </w:rPr>
-        <w:t xml:space="preserve">/s/ </w:t>
-      </w:r>
-      <w:proofErr w:type="gramStart"/>
-      <w:r>
-        <w:rPr>
-          <w:i/>
-          <w:iCs/>
-        </w:rPr>
-        <w:t xml:space="preserve">   </w:t>
-      </w:r>
-      <w:r>
-        <w:rPr>
-          <w:i/>
-          <w:iCs/>
-        </w:rPr>
-        <w:t>{</w:t>
-      </w:r>
-      <w:proofErr w:type="gramEnd"/>
-      <w:r>
-        <w:rPr>
-          <w:i/>
-          <w:iCs/>
-        </w:rPr>
-        <w:t>{</w:t>
-      </w:r>
-      <w:proofErr w:type="spellStart"/>
-      <w:r>
-        <w:rPr>
-          <w:i/>
-          <w:iCs/>
-        </w:rPr>
-        <w:t>associate_name</w:t>
-      </w:r>
-      <w:proofErr w:type="spellEnd"/>
-      <w:r>
-        <w:rPr>
-          <w:i/>
-          <w:iCs/>
-        </w:rPr>
-        <w:t>}}</w:t>
-      </w:r>
-    </w:p>
-    <w:p>
-      <w:pPr>
-        <w:pStyle w:val="AllPurpose"/>
-        <w:keepNext/>
-        <w:keepLines/>
-        <w:spacing w:line="240" w:lineRule="auto"/>
-      </w:pPr>
-      <w:r>
-        <w:tab/>
-      </w:r>
-      <w:r>
-        <w:tab/>
-      </w:r>
-      <w:r>
-        <w:tab/>
-      </w:r>
-      <w:r>
-        <w:tab/>
-      </w:r>
-      <w:r>
-        <w:tab/>
-      </w:r>
-      <w:r>
-        <w:tab/>
-      </w:r>
-      <w:r>
-        <w:t>Dale K. Galipo</w:t>
-      </w:r>
-    </w:p>
-    <w:p>
-      <w:pPr>
-        <w:pStyle w:val="AllPurpose"/>
-        <w:keepNext/>
-        <w:keepLines/>
-        <w:spacing w:line="240" w:lineRule="auto"/>
-      </w:pPr>
-      <w:r>
-        <w:tab/>
-      </w:r>
-      <w:r>
-        <w:tab/>
-      </w:r>
-      <w:r>
-        <w:tab/>
-      </w:r>
-      <w:r>
-        <w:tab/>
-      </w:r>
-      <w:r>
-        <w:tab/>
-      </w:r>
-      <w:r>
-        <w:tab/>
-      </w:r>
-      <w:r>
-        <w:t xml:space="preserve">{% if </w:t>
-      </w:r>
-      <w:proofErr w:type="spellStart"/>
-      <w:r>
-        <w:t>is_</w:t>
-      </w:r>
-      <w:r>
-        <w:t>joint</w:t>
-      </w:r>
-      <w:proofErr w:type="spellEnd"/>
-      <w:r>
-        <w:t xml:space="preserve"> </w:t>
-      </w:r>
-      <w:proofErr w:type="gramStart"/>
-      <w:r>
-        <w:t>%}</w:t>
-      </w:r>
-      <w:r>
-        <w:t>{</w:t>
-      </w:r>
-      <w:proofErr w:type="gramEnd"/>
-      <w:r>
-        <w:t>{</w:t>
-      </w:r>
-      <w:proofErr w:type="spellStart"/>
-      <w:r>
-        <w:t>associate_name</w:t>
-      </w:r>
-      <w:proofErr w:type="spellEnd"/>
-      <w:r>
-        <w:t>}}</w:t>
-      </w:r>
-      <w:r>
-        <w:footnoteReference w:id="2"/>
-      </w:r>
-      <w:r>
-        <w:t xml:space="preserve">{% else </w:t>
-      </w:r>
-      <w:proofErr w:type="gramStart"/>
-      <w:r>
-        <w:t>%}</w:t>
-      </w:r>
-      <w:r>
-        <w:t>{</w:t>
-      </w:r>
-      <w:proofErr w:type="gramEnd"/>
-      <w:r>
-        <w:t>{</w:t>
-      </w:r>
-      <w:proofErr w:type="spellStart"/>
-      <w:r>
-        <w:t>associate_name</w:t>
-      </w:r>
-      <w:proofErr w:type="spellEnd"/>
-      <w:proofErr w:type="gramStart"/>
-      <w:r>
-        <w:t>}}</w:t>
-      </w:r>
-      <w:r>
-        <w:t>{</w:t>
-      </w:r>
-      <w:proofErr w:type="gramEnd"/>
-      <w:r>
-        <w:t xml:space="preserve">% </w:t>
-      </w:r>
-      <w:proofErr w:type="gramStart"/>
-      <w:r>
-        <w:t>endif %}</w:t>
-      </w:r>
-      <w:proofErr w:type="gramEnd"/>
-    </w:p>
-    <w:p>
-      <w:pPr>
-        <w:pStyle w:val="normal0"/>
-      </w:pPr>
-      <w:r>
-        <w:tab/>
-      </w:r>
-      <w:r>
-        <w:tab/>
-      </w:r>
-      <w:r>
-        <w:tab/>
-      </w:r>
-      <w:r>
-        <w:tab/>
-      </w:r>
-      <w:r>
-        <w:tab/>
-      </w:r>
-      <w:r>
-        <w:rPr>
-          <w:i/>
-          <w:iCs/>
-        </w:rPr>
-        <w:t xml:space="preserve">Attorneys for </w:t>
-      </w:r>
-      <w:proofErr w:type="gramStart"/>
-      <w:r>
-        <w:rPr>
-          <w:i/>
-          <w:iCs/>
-        </w:rPr>
-        <w:t>{{ "</w:t>
-      </w:r>
-      <w:proofErr w:type="gramEnd"/>
-      <w:r>
-        <w:rPr>
-          <w:i/>
-          <w:iCs/>
-        </w:rPr>
-        <w:t xml:space="preserve">Plaintiffs" if </w:t>
-      </w:r>
-      <w:proofErr w:type="spellStart"/>
-      <w:r>
-        <w:rPr>
-          <w:i/>
-          <w:iCs/>
-        </w:rPr>
-        <w:t>multiple_plaintiffs</w:t>
-      </w:r>
-      <w:proofErr w:type="spellEnd"/>
-      <w:r>
-        <w:rPr>
-          <w:i/>
-          <w:iCs/>
-        </w:rPr>
-        <w:t xml:space="preserve"> else "Plaintiff</w:t>
-      </w:r>
-      <w:proofErr w:type="gramStart"/>
-      <w:r>
-        <w:rPr>
-          <w:i/>
-          <w:iCs/>
-        </w:rPr>
-        <w:t>" }</w:t>
-      </w:r>
-      <w:proofErr w:type="gramEnd"/>
-      <w:r>
-        <w:rPr>
-          <w:i/>
-          <w:iCs/>
-        </w:rPr>
         <w:t>}</w:t>
       </w:r>
     </w:p>
@@ -1597,7 +1136,7 @@
         <w:pStyle w:val="normal0"/>
       </w:pPr>
       <w:r>
-        <w:t xml:space="preserve">{%p if include_cert_compliance %}</w:t>
+        <w:t>{%p endif %}</w:t>
       </w:r>
     </w:p>
     <w:p>
@@ -1605,15 +1144,137 @@
         <w:pStyle w:val="normal0"/>
       </w:pPr>
       <w:r>
-        <w:t xml:space="preserve">{{ subdoc_cert_compliance }}</w:t>
+        <w:t xml:space="preserve">{%p if </w:t>
+      </w:r>
+      <w:proofErr w:type="spellStart"/>
+      <w:r>
+        <w:t>include_joint_stip</w:t>
+      </w:r>
+      <w:proofErr w:type="spellEnd"/>
+      <w:r>
+        <w:t xml:space="preserve"> %}</w:t>
       </w:r>
     </w:p>
     <w:p>
       <w:pPr>
         <w:pStyle w:val="normal0"/>
       </w:pPr>
+      <w:proofErr w:type="gramStart"/>
       <w:r>
-        <w:t xml:space="preserve">{%p endif %}</w:t>
+        <w:t xml:space="preserve">{{ </w:t>
+      </w:r>
+      <w:proofErr w:type="spellStart"/>
+      <w:r>
+        <w:t>subdoc</w:t>
+      </w:r>
+      <w:proofErr w:type="gramEnd"/>
+      <w:r>
+        <w:t>_joint_</w:t>
+      </w:r>
+      <w:proofErr w:type="gramStart"/>
+      <w:r>
+        <w:t>stip</w:t>
+      </w:r>
+      <w:proofErr w:type="spellEnd"/>
+      <w:r>
+        <w:t xml:space="preserve"> }</w:t>
+      </w:r>
+      <w:proofErr w:type="gramEnd"/>
+      <w:r>
+        <w:t>}</w:t>
+      </w:r>
+    </w:p>
+    <w:p>
+      <w:pPr>
+        <w:pStyle w:val="normal0"/>
+      </w:pPr>
+      <w:r>
+        <w:t>{%p endif %}</w:t>
+      </w:r>
+    </w:p>
+    <w:p>
+      <w:pPr>
+        <w:pStyle w:val="normal0"/>
+      </w:pPr>
+      <w:r>
+        <w:t xml:space="preserve">{%p if </w:t>
+      </w:r>
+      <w:proofErr w:type="spellStart"/>
+      <w:r>
+        <w:t>include_generic</w:t>
+      </w:r>
+      <w:proofErr w:type="spellEnd"/>
+      <w:r>
+        <w:t xml:space="preserve"> %}</w:t>
+      </w:r>
+    </w:p>
+    <w:p>
+      <w:pPr>
+        <w:pStyle w:val="normal0"/>
+      </w:pPr>
+      <w:proofErr w:type="gramStart"/>
+      <w:r>
+        <w:t xml:space="preserve">{{ </w:t>
+      </w:r>
+      <w:proofErr w:type="spellStart"/>
+      <w:r>
+        <w:t>subdoc</w:t>
+      </w:r>
+      <w:proofErr w:type="gramEnd"/>
+      <w:r>
+        <w:t>_</w:t>
+      </w:r>
+      <w:proofErr w:type="gramStart"/>
+      <w:r>
+        <w:t>generic</w:t>
+      </w:r>
+      <w:proofErr w:type="spellEnd"/>
+      <w:r>
+        <w:t xml:space="preserve"> }</w:t>
+      </w:r>
+      <w:proofErr w:type="gramEnd"/>
+      <w:r>
+        <w:t>}</w:t>
+      </w:r>
+    </w:p>
+    <w:p>
+      <w:pPr>
+        <w:pStyle w:val="normal0"/>
+      </w:pPr>
+      <w:r>
+        <w:t>{%p endif %}</w:t>
+      </w:r>
+    </w:p>
+    <w:p>
+      <w:pPr>
+        <w:pStyle w:val="normal0"/>
+      </w:pPr>
+      <w:r>
+        <w:t xml:space="preserve">{%p if </w:t>
+      </w:r>
+      <w:proofErr w:type="spellStart"/>
+      <w:r>
+        <w:t>include_cert_compliance</w:t>
+      </w:r>
+      <w:proofErr w:type="spellEnd"/>
+      <w:r>
+        <w:t xml:space="preserve"> %}</w:t>
+      </w:r>
+    </w:p>
+    <w:p>
+      <w:pPr>
+        <w:pStyle w:val="normal0"/>
+      </w:pPr>
+      <w:r>
+        <w:t>{{ subdoc_cert_compliance }}</w:t>
+      </w:r>
+    </w:p>
+    <w:p>
+      <w:pPr>
+        <w:pStyle w:val="normal0"/>
+      </w:pPr>
+      <w:r>
+        <w:t>{%p endif %}</w:t>
       </w:r>
     </w:p>
     <w:sectPr>
@@ -1742,22 +1403,6 @@
       <w:pPr>
         <w:spacing w:line="240" w:lineRule="auto"/>
       </w:pPr>
-    </w:p>
-  </w:footnote>
-  <w:footnote w:id="2">
-    <w:p>
-      <w:r>
-        <w:rPr>
-          <w:rStyle w:val="FootnoteReference"/>
-        </w:rPr>
-        <w:footnoteRef/>
-      </w:r>
-      <w:r>
-        <w:t xml:space="preserve"> </w:t>
-      </w:r>
-      <w:r>
-        <w:t>Pursuant to Local Rule 5-4.3.4, as the filer of this document, I attest that all other signatories listed, and on whose behalf the filing is submitted, concur in the filing’s content and have authorized the filing.</w:t>
-      </w:r>
     </w:p>
   </w:footnote>
 </w:footnotes>
@@ -3281,7 +2926,7 @@
           <wp:extent cx="2982595" cy="713105"/>
           <wp:effectExtent l="0" t="8255" r="0" b="0"/>
           <wp:wrapTopAndBottom/>
-          <wp:docPr id="1599413689" name="Picture 8"/>
+          <wp:docPr id="1128854769" name="Picture 8"/>
           <wp:cNvGraphicFramePr>
             <a:graphicFrameLocks xmlns:a="http://schemas.openxmlformats.org/drawingml/2006/main" noChangeAspect="1"/>
           </wp:cNvGraphicFramePr>
@@ -8363,16 +8008,6 @@
 </file>
 
 <file path=customXml/item2.xml><?xml version="1.0" encoding="utf-8"?>
-<b:Sources xmlns:b="http://schemas.openxmlformats.org/officeDocument/2006/bibliography" xmlns="http://schemas.openxmlformats.org/officeDocument/2006/bibliography" SelectedStyle="\APASixthEditionOfficeOnline.xsl" StyleName="APA" Version="6"/>
-</file>
-
-<file path=customXml/item3.xml><?xml version="1.0" encoding="utf-8"?>
-<caseData xmlns="urn:custom-schema">
-  <Plaintiffs/>
-</caseData>
-</file>
-
-<file path=customXml/item4.xml><?xml version="1.0" encoding="utf-8"?>
 <caseData xmlns="urn:custom-schema">
   <Plaintiffs>Dorothey Heimbach</Plaintiffs>
   <AuthorName>Cooper Alison-Mayne</AuthorName>
@@ -8381,13 +8016,23 @@
 </caseData>
 </file>
 
-<file path=customXml/item5.xml><?xml version="1.0" encoding="utf-8"?>
+<file path=customXml/item3.xml><?xml version="1.0" encoding="utf-8"?>
 <caseData xmlns="urn:custom-schema">
   <Plaintiffs>John Doe, Jane Smith</Plaintiffs>
   <AuthorName>Cooper Alison-Mayne</AuthorName>
   <Email/>
   <CaseNumber>12345-A</CaseNumber>
   <SingPlur>Plaintiff</SingPlur>
+</caseData>
+</file>
+
+<file path=customXml/item4.xml><?xml version="1.0" encoding="utf-8"?>
+<b:Sources xmlns:b="http://schemas.openxmlformats.org/officeDocument/2006/bibliography" xmlns="http://schemas.openxmlformats.org/officeDocument/2006/bibliography" SelectedStyle="\APASixthEditionOfficeOnline.xsl" StyleName="APA" Version="6"/>
+</file>
+
+<file path=customXml/item5.xml><?xml version="1.0" encoding="utf-8"?>
+<caseData xmlns="urn:custom-schema">
+  <Plaintiffs/>
 </caseData>
 </file>
 
@@ -8400,6 +8045,22 @@
 </file>
 
 <file path=customXml/itemProps2.xml><?xml version="1.0" encoding="utf-8"?>
+<ds:datastoreItem xmlns:ds="http://schemas.openxmlformats.org/officeDocument/2006/customXml" ds:itemID="{A9C54615-EF12-4B3A-9614-573ABB2997F0}">
+  <ds:schemaRefs>
+    <ds:schemaRef ds:uri="urn:custom-schema"/>
+  </ds:schemaRefs>
+</ds:datastoreItem>
+</file>
+
+<file path=customXml/itemProps3.xml><?xml version="1.0" encoding="utf-8"?>
+<ds:datastoreItem xmlns:ds="http://schemas.openxmlformats.org/officeDocument/2006/customXml" ds:itemID="{741DB435-B643-4E53-9915-012E740CA925}">
+  <ds:schemaRefs>
+    <ds:schemaRef ds:uri="urn:custom-schema"/>
+  </ds:schemaRefs>
+</ds:datastoreItem>
+</file>
+
+<file path=customXml/itemProps4.xml><?xml version="1.0" encoding="utf-8"?>
 <ds:datastoreItem xmlns:ds="http://schemas.openxmlformats.org/officeDocument/2006/customXml" ds:itemID="{C036A6A0-214D-4DFD-B68C-05C096AFD24C}">
   <ds:schemaRefs>
     <ds:schemaRef ds:uri="http://schemas.openxmlformats.org/officeDocument/2006/bibliography"/>
@@ -8407,26 +8068,10 @@
 </ds:datastoreItem>
 </file>
 
-<file path=customXml/itemProps3.xml><?xml version="1.0" encoding="utf-8"?>
+<file path=customXml/itemProps5.xml><?xml version="1.0" encoding="utf-8"?>
 <ds:datastoreItem xmlns:ds="http://schemas.openxmlformats.org/officeDocument/2006/customXml" ds:itemID="{061753FD-292F-480D-BDB1-9F83B63E1DD8}">
   <ds:schemaRefs>
     <ds:schemaRef ds:uri="urn:custom-schema"/>
   </ds:schemaRefs>
 </ds:datastoreItem>
-</file>
-
-<file path=customXml/itemProps4.xml><?xml version="1.0" encoding="utf-8"?>
-<ds:datastoreItem xmlns:ds="http://schemas.openxmlformats.org/officeDocument/2006/customXml" ds:itemID="{A9C54615-EF12-4B3A-9614-573ABB2997F0}">
-  <ds:schemaRefs>
-    <ds:schemaRef ds:uri="urn:custom-schema"/>
-  </ds:schemaRefs>
-</ds:datastoreItem>
-</file>
-
-<file path=customXml/itemProps5.xml><?xml version="1.0" encoding="utf-8"?>
-<ds:datastoreItem xmlns:ds="http://schemas.openxmlformats.org/officeDocument/2006/customXml" ds:itemID="{741DB435-B643-4E53-9915-012E740CA925}">
-  <ds:schemaRefs>
-    <ds:schemaRef ds:uri="urn:custom-schema"/>
-  </ds:schemaRefs>
-</ds:datastoreItem>
 </file>
</xml_diff>

<commit_message>
fix: pre-render fragments to resolve Jinja2 vars, preserve TOC/TOA field codes
Fragments are now pre-rendered before subdoc insertion so template
variables (attorney name, bar number, etc.) are resolved. TOC and TOA
fragments skip pre-rendering to preserve Word field codes. Also makes
the template form always visible without requiring PDF upload first.

Co-Authored-By: Claude Opus 4.5 <noreply@anthropic.com>
</commit_message>
<xml_diff>
--- a/templates/pleadings/base_subdoc.docx
+++ b/templates/pleadings/base_subdoc.docx
@@ -74,38 +74,22 @@
               <w:ind w:left="72"/>
             </w:pPr>
             <w:r>
-              <w:t>{{</w:t>
-            </w:r>
-            <w:proofErr w:type="spellStart"/>
-            <w:r>
-              <w:t>associate</w:t>
+              <w:t>{{associate</w:t>
             </w:r>
             <w:r>
               <w:t>_n</w:t>
             </w:r>
             <w:r>
-              <w:t>ame</w:t>
-            </w:r>
-            <w:proofErr w:type="spellEnd"/>
-            <w:r>
-              <w:t>}} (SBN</w:t>
+              <w:t>ame}} (SBN</w:t>
             </w:r>
             <w:r>
-              <w:t xml:space="preserve"> {{</w:t>
-            </w:r>
-            <w:proofErr w:type="spellStart"/>
-            <w:r>
-              <w:t>associate</w:t>
+              <w:t xml:space="preserve"> {{associate</w:t>
             </w:r>
             <w:r>
               <w:t>_b</w:t>
             </w:r>
             <w:r>
-              <w:t>ar</w:t>
-            </w:r>
-            <w:proofErr w:type="spellEnd"/>
-            <w:r>
-              <w:t>}})</w:t>
+              <w:t>ar}})</w:t>
             </w:r>
           </w:p>
           <w:p>
@@ -115,21 +99,13 @@
               <w:ind w:left="72"/>
             </w:pPr>
             <w:r>
-              <w:t>{{</w:t>
-            </w:r>
-            <w:proofErr w:type="spellStart"/>
-            <w:r>
-              <w:t>associate</w:t>
+              <w:t>{{associate</w:t>
             </w:r>
             <w:r>
               <w:t>_e</w:t>
             </w:r>
             <w:r>
-              <w:t>mail</w:t>
-            </w:r>
-            <w:proofErr w:type="spellEnd"/>
-            <w:r>
-              <w:t>}}</w:t>
+              <w:t>mail}}</w:t>
             </w:r>
           </w:p>
           <w:p>
@@ -184,37 +160,12 @@
               <w:t xml:space="preserve">Attorneys for </w:t>
             </w:r>
             <w:bookmarkEnd w:id="0"/>
-            <w:proofErr w:type="gramStart"/>
             <w:r>
               <w:rPr>
                 <w:i/>
                 <w:iCs/>
               </w:rPr>
-              <w:t>{{ "</w:t>
-            </w:r>
-            <w:proofErr w:type="gramEnd"/>
-            <w:r>
-              <w:rPr>
-                <w:i/>
-                <w:iCs/>
-              </w:rPr>
-              <w:t xml:space="preserve">Plaintiffs" if </w:t>
-            </w:r>
-            <w:proofErr w:type="spellStart"/>
-            <w:r>
-              <w:rPr>
-                <w:i/>
-                <w:iCs/>
-              </w:rPr>
-              <w:t>multiple_plaintiffs</w:t>
-            </w:r>
-            <w:proofErr w:type="spellEnd"/>
-            <w:r>
-              <w:rPr>
-                <w:i/>
-                <w:iCs/>
-              </w:rPr>
-              <w:t xml:space="preserve"> else "Plaintiff" }}</w:t>
+              <w:t>{{ "Plaintiffs" if multiple_plaintiffs else "Plaintiff" }}</w:t>
             </w:r>
           </w:p>
         </w:tc>
@@ -343,11 +294,9 @@
             <w:r>
               <w:t>{{</w:t>
             </w:r>
-            <w:proofErr w:type="spellStart"/>
             <w:r>
               <w:t>plaintiff_caption</w:t>
             </w:r>
-            <w:proofErr w:type="spellEnd"/>
             <w:r>
               <w:t>}},</w:t>
             </w:r>
@@ -372,32 +321,14 @@
             <w:r>
               <w:tab/>
             </w:r>
-            <w:proofErr w:type="gramStart"/>
             <w:r>
-              <w:t>{{ "</w:t>
-            </w:r>
-            <w:proofErr w:type="gramEnd"/>
-            <w:r>
-              <w:t xml:space="preserve">Plaintiffs" if </w:t>
-            </w:r>
-            <w:proofErr w:type="spellStart"/>
-            <w:r>
-              <w:t>multiple_pl</w:t>
+              <w:t>{{ "Plaintiffs" if multiple_pl</w:t>
             </w:r>
             <w:r>
               <w:t>aintiffs</w:t>
             </w:r>
-            <w:proofErr w:type="spellEnd"/>
             <w:r>
-              <w:t xml:space="preserve"> else "Plaintiff</w:t>
-            </w:r>
-            <w:proofErr w:type="gramStart"/>
-            <w:r>
-              <w:t>" }</w:t>
-            </w:r>
-            <w:proofErr w:type="gramEnd"/>
-            <w:r>
-              <w:t>}</w:t>
+              <w:t xml:space="preserve"> else "Plaintiff" }}</w:t>
             </w:r>
             <w:r>
               <w:t>,</w:t>
@@ -438,11 +369,9 @@
             <w:r>
               <w:t>{{</w:t>
             </w:r>
-            <w:proofErr w:type="spellStart"/>
             <w:r>
               <w:t>defendant_caption</w:t>
             </w:r>
-            <w:proofErr w:type="spellEnd"/>
             <w:r>
               <w:t>}},</w:t>
             </w:r>
@@ -467,38 +396,26 @@
             <w:r>
               <w:tab/>
             </w:r>
-            <w:proofErr w:type="gramStart"/>
             <w:r>
               <w:t>{{ "</w:t>
             </w:r>
-            <w:proofErr w:type="gramEnd"/>
             <w:r>
               <w:t>Defendants</w:t>
             </w:r>
             <w:r>
-              <w:t xml:space="preserve">" if </w:t>
-            </w:r>
-            <w:proofErr w:type="spellStart"/>
-            <w:r>
-              <w:t>multiple_</w:t>
+              <w:t>" if multiple_</w:t>
             </w:r>
             <w:r>
               <w:t>defendants</w:t>
             </w:r>
-            <w:proofErr w:type="spellEnd"/>
             <w:r>
               <w:t xml:space="preserve"> else "</w:t>
             </w:r>
             <w:r>
               <w:t>Defendant</w:t>
             </w:r>
-            <w:proofErr w:type="gramStart"/>
             <w:r>
-              <w:t>" }</w:t>
-            </w:r>
-            <w:proofErr w:type="gramEnd"/>
-            <w:r>
-              <w:t>}</w:t>
+              <w:t>" }}</w:t>
             </w:r>
             <w:r>
               <w:t>.</w:t>
@@ -564,23 +481,7 @@
                 <w:rFonts w:ascii="Times New Roman" w:hAnsi="Times New Roman"/>
                 <w:sz w:val="28"/>
               </w:rPr>
-              <w:t>Case No.: {{</w:t>
-            </w:r>
-            <w:proofErr w:type="spellStart"/>
-            <w:r>
-              <w:rPr>
-                <w:rFonts w:ascii="Times New Roman" w:hAnsi="Times New Roman"/>
-                <w:sz w:val="28"/>
-              </w:rPr>
-              <w:t>case_number</w:t>
-            </w:r>
-            <w:proofErr w:type="spellEnd"/>
-            <w:r>
-              <w:rPr>
-                <w:rFonts w:ascii="Times New Roman" w:hAnsi="Times New Roman"/>
-                <w:sz w:val="28"/>
-              </w:rPr>
-              <w:t>}}</w:t>
+              <w:t>Case No.: {{case_number}}</w:t>
             </w:r>
           </w:p>
           <w:p>
@@ -600,23 +501,7 @@
                 <w:rFonts w:ascii="Times New Roman" w:hAnsi="Times New Roman"/>
                 <w:sz w:val="28"/>
               </w:rPr>
-              <w:t>{{</w:t>
-            </w:r>
-            <w:proofErr w:type="spellStart"/>
-            <w:r>
-              <w:rPr>
-                <w:rFonts w:ascii="Times New Roman" w:hAnsi="Times New Roman"/>
-                <w:sz w:val="28"/>
-              </w:rPr>
-              <w:t>judge_name</w:t>
-            </w:r>
-            <w:proofErr w:type="spellEnd"/>
-            <w:r>
-              <w:rPr>
-                <w:rFonts w:ascii="Times New Roman" w:hAnsi="Times New Roman"/>
-                <w:sz w:val="28"/>
-              </w:rPr>
-              <w:t>}}</w:t>
+              <w:t>{{judge_name}}</w:t>
             </w:r>
           </w:p>
           <w:p>
@@ -636,23 +521,7 @@
                 <w:rFonts w:ascii="Times New Roman" w:hAnsi="Times New Roman"/>
                 <w:sz w:val="28"/>
               </w:rPr>
-              <w:t>{{</w:t>
-            </w:r>
-            <w:proofErr w:type="spellStart"/>
-            <w:r>
-              <w:rPr>
-                <w:rFonts w:ascii="Times New Roman" w:hAnsi="Times New Roman"/>
-                <w:sz w:val="28"/>
-              </w:rPr>
-              <w:t>mag_judge_name</w:t>
-            </w:r>
-            <w:proofErr w:type="spellEnd"/>
-            <w:r>
-              <w:rPr>
-                <w:rFonts w:ascii="Times New Roman" w:hAnsi="Times New Roman"/>
-                <w:sz w:val="28"/>
-              </w:rPr>
-              <w:t>}}</w:t>
+              <w:t>{{mag_judge_name}}</w:t>
             </w:r>
           </w:p>
           <w:p>
@@ -731,23 +600,7 @@
                 <w:rFonts w:ascii="Times New Roman" w:hAnsi="Times New Roman"/>
                 <w:sz w:val="28"/>
               </w:rPr>
-              <w:t xml:space="preserve">{%p if </w:t>
-            </w:r>
-            <w:proofErr w:type="spellStart"/>
-            <w:r>
-              <w:rPr>
-                <w:rFonts w:ascii="Times New Roman" w:hAnsi="Times New Roman"/>
-                <w:sz w:val="28"/>
-              </w:rPr>
-              <w:t>hearing_info</w:t>
-            </w:r>
-            <w:proofErr w:type="spellEnd"/>
-            <w:r>
-              <w:rPr>
-                <w:rFonts w:ascii="Times New Roman" w:hAnsi="Times New Roman"/>
-                <w:sz w:val="28"/>
-              </w:rPr>
-              <w:t xml:space="preserve"> %}</w:t>
+              <w:t>{%p if hearing_info %}</w:t>
             </w:r>
           </w:p>
           <w:p>
@@ -780,15 +633,7 @@
                 <w:rFonts w:ascii="Times New Roman" w:hAnsi="Times New Roman"/>
                 <w:sz w:val="28"/>
               </w:rPr>
-              <w:t>Date:</w:t>
-            </w:r>
-            <w:proofErr w:type="gramStart"/>
-            <w:r>
-              <w:rPr>
-                <w:rFonts w:ascii="Times New Roman" w:hAnsi="Times New Roman"/>
-                <w:sz w:val="28"/>
-              </w:rPr>
-              <w:t xml:space="preserve"> </w:t>
+              <w:t xml:space="preserve">Date: </w:t>
             </w:r>
             <w:r>
               <w:rPr>
@@ -802,31 +647,7 @@
                 <w:rFonts w:ascii="Times New Roman" w:hAnsi="Times New Roman"/>
                 <w:sz w:val="28"/>
               </w:rPr>
-              <w:t>{</w:t>
-            </w:r>
-            <w:proofErr w:type="gramEnd"/>
-            <w:r>
-              <w:rPr>
-                <w:rFonts w:ascii="Times New Roman" w:hAnsi="Times New Roman"/>
-                <w:sz w:val="28"/>
-              </w:rPr>
-              <w:t>{</w:t>
-            </w:r>
-            <w:proofErr w:type="spellStart"/>
-            <w:r>
-              <w:rPr>
-                <w:rFonts w:ascii="Times New Roman" w:hAnsi="Times New Roman"/>
-                <w:sz w:val="28"/>
-              </w:rPr>
-              <w:t>hearing_date</w:t>
-            </w:r>
-            <w:proofErr w:type="spellEnd"/>
-            <w:r>
-              <w:rPr>
-                <w:rFonts w:ascii="Times New Roman" w:hAnsi="Times New Roman"/>
-                <w:sz w:val="28"/>
-              </w:rPr>
-              <w:t>}}</w:t>
+              <w:t>{{hearing_date}}</w:t>
             </w:r>
           </w:p>
           <w:p>
@@ -846,15 +667,7 @@
                 <w:rFonts w:ascii="Times New Roman" w:hAnsi="Times New Roman"/>
                 <w:sz w:val="28"/>
               </w:rPr>
-              <w:t>Time</w:t>
-            </w:r>
-            <w:proofErr w:type="gramStart"/>
-            <w:r>
-              <w:rPr>
-                <w:rFonts w:ascii="Times New Roman" w:hAnsi="Times New Roman"/>
-                <w:sz w:val="28"/>
-              </w:rPr>
-              <w:t xml:space="preserve">: </w:t>
+              <w:t xml:space="preserve">Time: </w:t>
             </w:r>
             <w:r>
               <w:rPr>
@@ -868,31 +681,7 @@
                 <w:rFonts w:ascii="Times New Roman" w:hAnsi="Times New Roman"/>
                 <w:sz w:val="28"/>
               </w:rPr>
-              <w:t>{</w:t>
-            </w:r>
-            <w:proofErr w:type="gramEnd"/>
-            <w:r>
-              <w:rPr>
-                <w:rFonts w:ascii="Times New Roman" w:hAnsi="Times New Roman"/>
-                <w:sz w:val="28"/>
-              </w:rPr>
-              <w:t>{</w:t>
-            </w:r>
-            <w:proofErr w:type="spellStart"/>
-            <w:r>
-              <w:rPr>
-                <w:rFonts w:ascii="Times New Roman" w:hAnsi="Times New Roman"/>
-                <w:sz w:val="28"/>
-              </w:rPr>
-              <w:t>hearing_time</w:t>
-            </w:r>
-            <w:proofErr w:type="spellEnd"/>
-            <w:r>
-              <w:rPr>
-                <w:rFonts w:ascii="Times New Roman" w:hAnsi="Times New Roman"/>
-                <w:sz w:val="28"/>
-              </w:rPr>
-              <w:t>}}</w:t>
+              <w:t>{{hearing_time}}</w:t>
             </w:r>
           </w:p>
           <w:p>
@@ -907,37 +696,12 @@
                 <w:sz w:val="28"/>
               </w:rPr>
             </w:pPr>
-            <w:proofErr w:type="spellStart"/>
             <w:r>
               <w:rPr>
                 <w:rFonts w:ascii="Times New Roman" w:hAnsi="Times New Roman"/>
                 <w:sz w:val="28"/>
               </w:rPr>
-              <w:t>Crtrm</w:t>
-            </w:r>
-            <w:proofErr w:type="spellEnd"/>
-            <w:r>
-              <w:rPr>
-                <w:rFonts w:ascii="Times New Roman" w:hAnsi="Times New Roman"/>
-                <w:sz w:val="28"/>
-              </w:rPr>
-              <w:t>: {{</w:t>
-            </w:r>
-            <w:proofErr w:type="spellStart"/>
-            <w:r>
-              <w:rPr>
-                <w:rFonts w:ascii="Times New Roman" w:hAnsi="Times New Roman"/>
-                <w:sz w:val="28"/>
-              </w:rPr>
-              <w:t>hearing_location</w:t>
-            </w:r>
-            <w:proofErr w:type="spellEnd"/>
-            <w:r>
-              <w:rPr>
-                <w:rFonts w:ascii="Times New Roman" w:hAnsi="Times New Roman"/>
-                <w:sz w:val="28"/>
-              </w:rPr>
-              <w:t>}}</w:t>
+              <w:t>Crtrm: {{hearing_location}}</w:t>
             </w:r>
           </w:p>
           <w:p>
@@ -1026,7 +790,13 @@
         <w:pStyle w:val="normal0"/>
       </w:pPr>
       <w:r>
-        <w:t>{{ subdoc_toc }}</w:t>
+        <w:t>{{ subdoc_</w:t>
+      </w:r>
+      <w:r>
+        <w:t>toc</w:t>
+      </w:r>
+      <w:r>
+        <w:t xml:space="preserve"> }}</w:t>
       </w:r>
     </w:p>
     <w:p>
@@ -1050,7 +820,13 @@
         <w:pStyle w:val="normal0"/>
       </w:pPr>
       <w:r>
-        <w:t>{{ subdoc_toa }}</w:t>
+        <w:t>{{ subdoc_</w:t>
+      </w:r>
+      <w:r>
+        <w:t>toa</w:t>
+      </w:r>
+      <w:r>
+        <w:t xml:space="preserve"> }}</w:t>
       </w:r>
     </w:p>
     <w:p>
@@ -1091,44 +867,15 @@
         <w:pStyle w:val="normal0"/>
       </w:pPr>
       <w:r>
-        <w:t xml:space="preserve">{%p if </w:t>
-      </w:r>
-      <w:proofErr w:type="spellStart"/>
-      <w:r>
-        <w:t>include_declaration</w:t>
-      </w:r>
-      <w:proofErr w:type="spellEnd"/>
-      <w:r>
-        <w:t xml:space="preserve"> %}</w:t>
+        <w:t>{%p if include_declaration %}</w:t>
       </w:r>
     </w:p>
     <w:p>
       <w:pPr>
         <w:pStyle w:val="normal0"/>
       </w:pPr>
-      <w:proofErr w:type="gramStart"/>
       <w:r>
-        <w:t xml:space="preserve">{{ </w:t>
-      </w:r>
-      <w:proofErr w:type="spellStart"/>
-      <w:r>
-        <w:t>subdoc</w:t>
-      </w:r>
-      <w:proofErr w:type="gramEnd"/>
-      <w:r>
-        <w:t>_</w:t>
-      </w:r>
-      <w:proofErr w:type="gramStart"/>
-      <w:r>
-        <w:t>declaration</w:t>
-      </w:r>
-      <w:proofErr w:type="spellEnd"/>
-      <w:r>
-        <w:t xml:space="preserve"> }</w:t>
-      </w:r>
-      <w:proofErr w:type="gramEnd"/>
-      <w:r>
-        <w:t>}</w:t>
+        <w:t>{{ subdoc_declaration }}</w:t>
       </w:r>
     </w:p>
     <w:p>
@@ -1144,44 +891,15 @@
         <w:pStyle w:val="normal0"/>
       </w:pPr>
       <w:r>
-        <w:t xml:space="preserve">{%p if </w:t>
-      </w:r>
-      <w:proofErr w:type="spellStart"/>
-      <w:r>
-        <w:t>include_joint_stip</w:t>
-      </w:r>
-      <w:proofErr w:type="spellEnd"/>
-      <w:r>
-        <w:t xml:space="preserve"> %}</w:t>
+        <w:t>{%p if include_joint_stip %}</w:t>
       </w:r>
     </w:p>
     <w:p>
       <w:pPr>
         <w:pStyle w:val="normal0"/>
       </w:pPr>
-      <w:proofErr w:type="gramStart"/>
       <w:r>
-        <w:t xml:space="preserve">{{ </w:t>
-      </w:r>
-      <w:proofErr w:type="spellStart"/>
-      <w:r>
-        <w:t>subdoc</w:t>
-      </w:r>
-      <w:proofErr w:type="gramEnd"/>
-      <w:r>
-        <w:t>_joint_</w:t>
-      </w:r>
-      <w:proofErr w:type="gramStart"/>
-      <w:r>
-        <w:t>stip</w:t>
-      </w:r>
-      <w:proofErr w:type="spellEnd"/>
-      <w:r>
-        <w:t xml:space="preserve"> }</w:t>
-      </w:r>
-      <w:proofErr w:type="gramEnd"/>
-      <w:r>
-        <w:t>}</w:t>
+        <w:t>{{ subdoc_joint_stip }}</w:t>
       </w:r>
     </w:p>
     <w:p>
@@ -1197,44 +915,15 @@
         <w:pStyle w:val="normal0"/>
       </w:pPr>
       <w:r>
-        <w:t xml:space="preserve">{%p if </w:t>
-      </w:r>
-      <w:proofErr w:type="spellStart"/>
-      <w:r>
-        <w:t>include_generic</w:t>
-      </w:r>
-      <w:proofErr w:type="spellEnd"/>
-      <w:r>
-        <w:t xml:space="preserve"> %}</w:t>
+        <w:t>{%p if include_generic %}</w:t>
       </w:r>
     </w:p>
     <w:p>
       <w:pPr>
         <w:pStyle w:val="normal0"/>
       </w:pPr>
-      <w:proofErr w:type="gramStart"/>
       <w:r>
-        <w:t xml:space="preserve">{{ </w:t>
-      </w:r>
-      <w:proofErr w:type="spellStart"/>
-      <w:r>
-        <w:t>subdoc</w:t>
-      </w:r>
-      <w:proofErr w:type="gramEnd"/>
-      <w:r>
-        <w:t>_</w:t>
-      </w:r>
-      <w:proofErr w:type="gramStart"/>
-      <w:r>
-        <w:t>generic</w:t>
-      </w:r>
-      <w:proofErr w:type="spellEnd"/>
-      <w:r>
-        <w:t xml:space="preserve"> }</w:t>
-      </w:r>
-      <w:proofErr w:type="gramEnd"/>
-      <w:r>
-        <w:t>}</w:t>
+        <w:t>{{ subdoc_generic }}</w:t>
       </w:r>
     </w:p>
     <w:p>
@@ -1250,15 +939,7 @@
         <w:pStyle w:val="normal0"/>
       </w:pPr>
       <w:r>
-        <w:t xml:space="preserve">{%p if </w:t>
-      </w:r>
-      <w:proofErr w:type="spellStart"/>
-      <w:r>
-        <w:t>include_cert_compliance</w:t>
-      </w:r>
-      <w:proofErr w:type="spellEnd"/>
-      <w:r>
-        <w:t xml:space="preserve"> %}</w:t>
+        <w:t>{%p if include_cert_compliance %}</w:t>
       </w:r>
     </w:p>
     <w:p>
@@ -8009,6 +7690,12 @@
 
 <file path=customXml/item2.xml><?xml version="1.0" encoding="utf-8"?>
 <caseData xmlns="urn:custom-schema">
+  <Plaintiffs/>
+</caseData>
+</file>
+
+<file path=customXml/item3.xml><?xml version="1.0" encoding="utf-8"?>
+<caseData xmlns="urn:custom-schema">
   <Plaintiffs>Dorothey Heimbach</Plaintiffs>
   <AuthorName>Cooper Alison-Mayne</AuthorName>
   <Email/>
@@ -8016,7 +7703,7 @@
 </caseData>
 </file>
 
-<file path=customXml/item3.xml><?xml version="1.0" encoding="utf-8"?>
+<file path=customXml/item4.xml><?xml version="1.0" encoding="utf-8"?>
 <caseData xmlns="urn:custom-schema">
   <Plaintiffs>John Doe, Jane Smith</Plaintiffs>
   <AuthorName>Cooper Alison-Mayne</AuthorName>
@@ -8026,14 +7713,8 @@
 </caseData>
 </file>
 
-<file path=customXml/item4.xml><?xml version="1.0" encoding="utf-8"?>
+<file path=customXml/item5.xml><?xml version="1.0" encoding="utf-8"?>
 <b:Sources xmlns:b="http://schemas.openxmlformats.org/officeDocument/2006/bibliography" xmlns="http://schemas.openxmlformats.org/officeDocument/2006/bibliography" SelectedStyle="\APASixthEditionOfficeOnline.xsl" StyleName="APA" Version="6"/>
-</file>
-
-<file path=customXml/item5.xml><?xml version="1.0" encoding="utf-8"?>
-<caseData xmlns="urn:custom-schema">
-  <Plaintiffs/>
-</caseData>
 </file>
 
 <file path=customXml/itemProps1.xml><?xml version="1.0" encoding="utf-8"?>
@@ -8045,6 +7726,14 @@
 </file>
 
 <file path=customXml/itemProps2.xml><?xml version="1.0" encoding="utf-8"?>
+<ds:datastoreItem xmlns:ds="http://schemas.openxmlformats.org/officeDocument/2006/customXml" ds:itemID="{061753FD-292F-480D-BDB1-9F83B63E1DD8}">
+  <ds:schemaRefs>
+    <ds:schemaRef ds:uri="urn:custom-schema"/>
+  </ds:schemaRefs>
+</ds:datastoreItem>
+</file>
+
+<file path=customXml/itemProps3.xml><?xml version="1.0" encoding="utf-8"?>
 <ds:datastoreItem xmlns:ds="http://schemas.openxmlformats.org/officeDocument/2006/customXml" ds:itemID="{A9C54615-EF12-4B3A-9614-573ABB2997F0}">
   <ds:schemaRefs>
     <ds:schemaRef ds:uri="urn:custom-schema"/>
@@ -8052,7 +7741,7 @@
 </ds:datastoreItem>
 </file>
 
-<file path=customXml/itemProps3.xml><?xml version="1.0" encoding="utf-8"?>
+<file path=customXml/itemProps4.xml><?xml version="1.0" encoding="utf-8"?>
 <ds:datastoreItem xmlns:ds="http://schemas.openxmlformats.org/officeDocument/2006/customXml" ds:itemID="{741DB435-B643-4E53-9915-012E740CA925}">
   <ds:schemaRefs>
     <ds:schemaRef ds:uri="urn:custom-schema"/>
@@ -8060,18 +7749,10 @@
 </ds:datastoreItem>
 </file>
 
-<file path=customXml/itemProps4.xml><?xml version="1.0" encoding="utf-8"?>
+<file path=customXml/itemProps5.xml><?xml version="1.0" encoding="utf-8"?>
 <ds:datastoreItem xmlns:ds="http://schemas.openxmlformats.org/officeDocument/2006/customXml" ds:itemID="{C036A6A0-214D-4DFD-B68C-05C096AFD24C}">
   <ds:schemaRefs>
     <ds:schemaRef ds:uri="http://schemas.openxmlformats.org/officeDocument/2006/bibliography"/>
   </ds:schemaRefs>
 </ds:datastoreItem>
-</file>
-
-<file path=customXml/itemProps5.xml><?xml version="1.0" encoding="utf-8"?>
-<ds:datastoreItem xmlns:ds="http://schemas.openxmlformats.org/officeDocument/2006/customXml" ds:itemID="{061753FD-292F-480D-BDB1-9F83B63E1DD8}">
-  <ds:schemaRefs>
-    <ds:schemaRef ds:uri="urn:custom-schema"/>
-  </ds:schemaRefs>
-</ds:datastoreItem>
 </file>
</xml_diff>